<commit_message>
Inject templater tags into docx variants using python automation
</commit_message>
<xml_diff>
--- a/public/templates/(Lashing) Talimatı ve Formu.docx
+++ b/public/templates/(Lashing) Talimatı ve Formu.docx
@@ -123,6 +123,19 @@
         </w:tc>
       </w:tr>
     </w:tbl>
+    <w:p>
+      <w:r>
+        <w:t>[SİSTEM BİLGİSİ - ZORUNLU ALANLAR]</w:t>
+        <w:br/>
+        <w:t>Firma: {companyName}</w:t>
+        <w:br/>
+        <w:t>Tarih: {date}</w:t>
+        <w:br/>
+        <w:t>Hazırlayan: {preparedBy}</w:t>
+        <w:br/>
+        <w:t>Açıklama: {description}</w:t>
+      </w:r>
+    </w:p>
     <w:p>
       <w:pPr>
         <w:spacing w:after="40" w:line="220" w:lineRule="auto"/>

</xml_diff>